<commit_message>
www: state TrustField as a Noetfield Systems Inc. product everywhere
Founder ruling 2026-07-30: TrustField is part of Noetfield. This reverses
the separate-venture boundary language from the SFF reconciliation across
every canonical page, the footer nav, social preview metadata, the
claims-boundary proof entry, the long-form SFF artifacts, and every
generator, test, and verification gate that enforced the old framing.
Validation claims stay scoped: synthetic demonstrations, bounded context,
no customers or revenue claimed.

Co-Authored-By: Claude Fable 5 <noreply@anthropic.com>
</commit_message>
<xml_diff>
--- a/public-interest/artifacts/SFF_Noetfield_Long_Form_For_Profit_RECONCILIATION_V1.docx
+++ b/public-interest/artifacts/SFF_Noetfield_Long_Form_For_Profit_RECONCILIATION_V1.docx
@@ -134,7 +134,7 @@
     </w:p>
     <w:p>
       <w:r>
-        <w:t>Noetfield Systems Inc. is a Vancouver-based AI-native systems company that builds governed execution infrastructure. Noetfield's current work includes the live client-zero execution application and SourceA / Runway execution and evidence infrastructure. TrustField is a separate venture whose synthetic regulated-workflow demonstrations provide a bounded validation context; it is not a Noetfield Systems Inc. product or subsidiary.</w:t>
+        <w:t>Noetfield Systems Inc. is a Vancouver-based AI-native systems company that builds governed execution infrastructure. Noetfield's current work includes the live client-zero execution application and SourceA / Runway execution and evidence infrastructure. TrustField is a Noetfield Systems Inc. product whose synthetic regulated-workflow demonstrations provide a bounded validation context.</w:t>
       </w:r>
     </w:p>
     <w:p>
@@ -269,7 +269,7 @@
     </w:p>
     <w:p>
       <w:r>
-        <w:t> TrustField separate-venture validation context. Within TrustField's own scope, synthetic workflow demonstrations cover case intake, analyst review, human FILE / NO-FILE / ESCALATE decisions, submission tracking, and evidence closure. TrustField explicitly states that it</w:t>
+        <w:t> TrustField product validation context. Within TrustField's own scope, synthetic workflow demonstrations cover case intake, analyst review, human FILE / NO-FILE / ESCALATE decisions, submission tracking, and evidence closure. TrustField explicitly states that it</w:t>
       </w:r>
     </w:p>
     <w:p>
@@ -1244,7 +1244,7 @@
     </w:p>
     <w:p>
       <w:r>
-        <w:t>Noetfield has already shipped a client-zero governed AI execution system and TrustField, a separate venture whose synthetic workflows demonstrate human decision gates and evidence boundaries within TrustField's own scope. The</w:t>
+        <w:t>Noetfield has already shipped a client-zero governed AI execution system and TrustField, a Noetfield Systems Inc. product whose synthetic workflows demonstrate human decision gates and evidence boundaries within TrustField's own scope. The</w:t>
       </w:r>
     </w:p>
     <w:p>

</xml_diff>